<commit_message>
Change version to 1.0.1.  Add load methods for XDocument and XElement.
</commit_message>
<xml_diff>
--- a/docs/XDocument.docx
+++ b/docs/XDocument.docx
@@ -2029,6 +2029,666 @@
           <w:szCs w:val="18"/>
         </w:rPr>
         <w:t xml:space="preserve">doc.root?.name.localName;  // 'root'</w:t>
+      </w:r>
+    </w:p>
+    <w:p>
+      <w:pPr>
+        <w:pBdr>
+          <w:bottom w:val="single" w:color="CCCCCC" w:sz="2"/>
+        </w:pBdr>
+        <w:spacing w:after="60" w:before="200"/>
+      </w:pPr>
+      <w:r>
+        <w:rPr>
+          <w:rFonts w:ascii="Consolas" w:cs="Consolas" w:eastAsia="Consolas" w:hAnsi="Consolas"/>
+          <w:b/>
+          <w:bCs/>
+          <w:color w:val="2F2F2F"/>
+          <w:sz w:val="24"/>
+          <w:szCs w:val="24"/>
+        </w:rPr>
+        <w:t xml:space="preserve">load</w:t>
+      </w:r>
+      <w:r>
+        <w:t xml:space="preserve">  </w:t>
+      </w:r>
+      <w:r>
+        <w:rPr>
+          <w:rFonts w:ascii="Calibri" w:cs="Calibri" w:eastAsia="Calibri" w:hAnsi="Calibri"/>
+          <w:b/>
+          <w:bCs/>
+          <w:color w:val="FFFFFF"/>
+          <w:sz w:val="16"/>
+          <w:szCs w:val="16"/>
+          <w:shd w:fill="7030A0" w:val="clear"/>
+        </w:rPr>
+        <w:t xml:space="preserve"> static method </w:t>
+      </w:r>
+    </w:p>
+    <w:p>
+      <w:pPr>
+        <w:spacing w:after="80"/>
+      </w:pPr>
+      <w:r>
+        <w:rPr>
+          <w:rFonts w:ascii="Calibri" w:cs="Calibri" w:eastAsia="Calibri" w:hAnsi="Calibri"/>
+          <w:b w:val="false"/>
+          <w:bCs w:val="false"/>
+          <w:i w:val="false"/>
+          <w:iCs w:val="false"/>
+          <w:color w:val="2F2F2F"/>
+          <w:sz w:val="20"/>
+          <w:szCs w:val="20"/>
+        </w:rPr>
+        <w:t xml:space="preserve">Reads an XML file synchronously and returns an XDocument, including any XML declaration. Throws XmlParseError on malformed input; the error's filePath field is set to the provided path.</w:t>
+      </w:r>
+    </w:p>
+    <w:p>
+      <w:pPr>
+        <w:spacing w:after="40" w:before="100"/>
+      </w:pPr>
+      <w:r>
+        <w:rPr>
+          <w:rFonts w:ascii="Calibri" w:cs="Calibri" w:eastAsia="Calibri" w:hAnsi="Calibri"/>
+          <w:b/>
+          <w:bCs/>
+          <w:color w:val="2F2F2F"/>
+          <w:sz w:val="20"/>
+          <w:szCs w:val="20"/>
+        </w:rPr>
+        <w:t xml:space="preserve">Signature</w:t>
+      </w:r>
+    </w:p>
+    <w:p>
+      <w:pPr>
+        <w:shd w:fill="F2F2F2" w:val="clear"/>
+        <w:spacing w:after="0" w:before="0"/>
+        <w:ind w:left="360"/>
+      </w:pPr>
+      <w:r>
+        <w:rPr>
+          <w:rFonts w:ascii="Consolas" w:cs="Consolas" w:eastAsia="Consolas" w:hAnsi="Consolas"/>
+          <w:color w:val="1F3864"/>
+          <w:sz w:val="18"/>
+          <w:szCs w:val="18"/>
+        </w:rPr>
+        <w:t xml:space="preserve">public static load(filePath: string): XDocument</w:t>
+      </w:r>
+    </w:p>
+    <w:p>
+      <w:pPr>
+        <w:spacing w:after="60"/>
+      </w:pPr>
+    </w:p>
+    <w:p>
+      <w:pPr>
+        <w:spacing w:after="40" w:before="100"/>
+      </w:pPr>
+      <w:r>
+        <w:rPr>
+          <w:rFonts w:ascii="Calibri" w:cs="Calibri" w:eastAsia="Calibri" w:hAnsi="Calibri"/>
+          <w:b/>
+          <w:bCs/>
+          <w:color w:val="2F2F2F"/>
+          <w:sz w:val="20"/>
+          <w:szCs w:val="20"/>
+        </w:rPr>
+        <w:t xml:space="preserve">Parameters</w:t>
+      </w:r>
+    </w:p>
+    <w:tbl>
+      <w:tblPr>
+        <w:tblW w:type="pct" w:w="100%"/>
+        <w:tblBorders>
+          <w:top w:val="single" w:color="auto" w:sz="4"/>
+          <w:left w:val="single" w:color="auto" w:sz="4"/>
+          <w:bottom w:val="single" w:color="auto" w:sz="4"/>
+          <w:right w:val="single" w:color="auto" w:sz="4"/>
+          <w:insideH w:val="single" w:color="auto" w:sz="4"/>
+          <w:insideV w:val="single" w:color="auto" w:sz="4"/>
+        </w:tblBorders>
+      </w:tblPr>
+      <w:tblGrid>
+        <w:gridCol w:w="100"/>
+        <w:gridCol w:w="100"/>
+        <w:gridCol w:w="100"/>
+      </w:tblGrid>
+      <w:tr>
+        <w:trPr>
+          <w:tblHeader/>
+        </w:trPr>
+        <w:tc>
+          <w:tcPr>
+            <w:tcW w:type="pct" w:w="22%"/>
+            <w:shd w:fill="2E74B5" w:val="clear"/>
+          </w:tcPr>
+          <w:p>
+            <w:pPr>
+              <w:jc w:val="center"/>
+            </w:pPr>
+            <w:r>
+              <w:rPr>
+                <w:rFonts w:ascii="Calibri" w:cs="Calibri" w:eastAsia="Calibri" w:hAnsi="Calibri"/>
+                <w:b/>
+                <w:bCs/>
+                <w:color w:val="FFFFFF"/>
+                <w:sz w:val="18"/>
+                <w:szCs w:val="18"/>
+              </w:rPr>
+              <w:t xml:space="preserve">Parameter</w:t>
+            </w:r>
+          </w:p>
+        </w:tc>
+        <w:tc>
+          <w:tcPr>
+            <w:tcW w:type="pct" w:w="22%"/>
+            <w:shd w:fill="2E74B5" w:val="clear"/>
+          </w:tcPr>
+          <w:p>
+            <w:pPr>
+              <w:jc w:val="center"/>
+            </w:pPr>
+            <w:r>
+              <w:rPr>
+                <w:rFonts w:ascii="Calibri" w:cs="Calibri" w:eastAsia="Calibri" w:hAnsi="Calibri"/>
+                <w:b/>
+                <w:bCs/>
+                <w:color w:val="FFFFFF"/>
+                <w:sz w:val="18"/>
+                <w:szCs w:val="18"/>
+              </w:rPr>
+              <w:t xml:space="preserve">Type</w:t>
+            </w:r>
+          </w:p>
+        </w:tc>
+        <w:tc>
+          <w:tcPr>
+            <w:tcW w:type="pct" w:w="56%"/>
+            <w:shd w:fill="2E74B5" w:val="clear"/>
+          </w:tcPr>
+          <w:p>
+            <w:pPr>
+              <w:jc w:val="center"/>
+            </w:pPr>
+            <w:r>
+              <w:rPr>
+                <w:rFonts w:ascii="Calibri" w:cs="Calibri" w:eastAsia="Calibri" w:hAnsi="Calibri"/>
+                <w:b/>
+                <w:bCs/>
+                <w:color w:val="FFFFFF"/>
+                <w:sz w:val="18"/>
+                <w:szCs w:val="18"/>
+              </w:rPr>
+              <w:t xml:space="preserve">Description</w:t>
+            </w:r>
+          </w:p>
+        </w:tc>
+      </w:tr>
+      <w:tr>
+        <w:tc>
+          <w:p>
+            <w:r>
+              <w:rPr>
+                <w:rFonts w:ascii="Consolas" w:cs="Consolas" w:eastAsia="Consolas" w:hAnsi="Consolas"/>
+                <w:color w:val="2F2F2F"/>
+                <w:sz w:val="18"/>
+                <w:szCs w:val="18"/>
+              </w:rPr>
+              <w:t xml:space="preserve">filePath</w:t>
+            </w:r>
+          </w:p>
+        </w:tc>
+        <w:tc>
+          <w:p>
+            <w:r>
+              <w:rPr>
+                <w:rFonts w:ascii="Consolas" w:cs="Consolas" w:eastAsia="Consolas" w:hAnsi="Consolas"/>
+                <w:color w:val="2F2F2F"/>
+                <w:sz w:val="18"/>
+                <w:szCs w:val="18"/>
+              </w:rPr>
+              <w:t xml:space="preserve">string</w:t>
+            </w:r>
+          </w:p>
+        </w:tc>
+        <w:tc>
+          <w:p>
+            <w:r>
+              <w:rPr>
+                <w:rFonts w:ascii="Consolas" w:cs="Consolas" w:eastAsia="Consolas" w:hAnsi="Consolas"/>
+                <w:color w:val="2F2F2F"/>
+                <w:sz w:val="18"/>
+                <w:szCs w:val="18"/>
+              </w:rPr>
+              <w:t xml:space="preserve">Absolute or relative path to an XML file.</w:t>
+            </w:r>
+          </w:p>
+        </w:tc>
+      </w:tr>
+    </w:tbl>
+    <w:p>
+      <w:pPr>
+        <w:spacing w:after="60"/>
+      </w:pPr>
+    </w:p>
+    <w:p>
+      <w:pPr>
+        <w:spacing w:after="40" w:before="100"/>
+      </w:pPr>
+      <w:r>
+        <w:rPr>
+          <w:rFonts w:ascii="Calibri" w:cs="Calibri" w:eastAsia="Calibri" w:hAnsi="Calibri"/>
+          <w:b/>
+          <w:bCs/>
+          <w:color w:val="2F2F2F"/>
+          <w:sz w:val="20"/>
+          <w:szCs w:val="20"/>
+        </w:rPr>
+        <w:t xml:space="preserve">Returns</w:t>
+      </w:r>
+    </w:p>
+    <w:p>
+      <w:pPr>
+        <w:spacing w:after="80"/>
+      </w:pPr>
+      <w:r>
+        <w:rPr>
+          <w:rFonts w:ascii="Calibri" w:cs="Calibri" w:eastAsia="Calibri" w:hAnsi="Calibri"/>
+          <w:b w:val="false"/>
+          <w:bCs w:val="false"/>
+          <w:i w:val="false"/>
+          <w:iCs w:val="false"/>
+          <w:color w:val="2F2F2F"/>
+          <w:sz w:val="20"/>
+          <w:szCs w:val="20"/>
+        </w:rPr>
+        <w:t xml:space="preserve">XDocument — the parsed document.</w:t>
+      </w:r>
+    </w:p>
+    <w:p>
+      <w:pPr>
+        <w:spacing w:after="40" w:before="100"/>
+      </w:pPr>
+      <w:r>
+        <w:rPr>
+          <w:rFonts w:ascii="Calibri" w:cs="Calibri" w:eastAsia="Calibri" w:hAnsi="Calibri"/>
+          <w:b/>
+          <w:bCs/>
+          <w:color w:val="2F2F2F"/>
+          <w:sz w:val="20"/>
+          <w:szCs w:val="20"/>
+        </w:rPr>
+        <w:t xml:space="preserve">Example</w:t>
+      </w:r>
+    </w:p>
+    <w:p>
+      <w:pPr>
+        <w:shd w:fill="F2F2F2" w:val="clear"/>
+        <w:spacing w:after="0" w:before="0"/>
+        <w:ind w:left="360"/>
+      </w:pPr>
+      <w:r>
+        <w:rPr>
+          <w:rFonts w:ascii="Consolas" w:cs="Consolas" w:eastAsia="Consolas" w:hAnsi="Consolas"/>
+          <w:color w:val="1F3864"/>
+          <w:sz w:val="18"/>
+          <w:szCs w:val="18"/>
+        </w:rPr>
+        <w:t xml:space="preserve">const doc = XDocument.load('/path/to/doc.xml');</w:t>
+      </w:r>
+    </w:p>
+    <w:p>
+      <w:pPr>
+        <w:shd w:fill="F2F2F2" w:val="clear"/>
+        <w:spacing w:after="0" w:before="0"/>
+        <w:ind w:left="360"/>
+      </w:pPr>
+      <w:r>
+        <w:rPr>
+          <w:rFonts w:ascii="Consolas" w:cs="Consolas" w:eastAsia="Consolas" w:hAnsi="Consolas"/>
+          <w:color w:val="1F3864"/>
+          <w:sz w:val="18"/>
+          <w:szCs w:val="18"/>
+        </w:rPr>
+        <w:t xml:space="preserve">doc.declaration?.encoding; // e.g. 'utf-8'</w:t>
+      </w:r>
+    </w:p>
+    <w:p>
+      <w:pPr>
+        <w:shd w:fill="F2F2F2" w:val="clear"/>
+        <w:spacing w:after="80" w:before="0"/>
+        <w:ind w:left="360"/>
+      </w:pPr>
+      <w:r>
+        <w:rPr>
+          <w:rFonts w:ascii="Consolas" w:cs="Consolas" w:eastAsia="Consolas" w:hAnsi="Consolas"/>
+          <w:color w:val="1F3864"/>
+          <w:sz w:val="18"/>
+          <w:szCs w:val="18"/>
+        </w:rPr>
+        <w:t xml:space="preserve">doc.root?.name.localName;  // e.g. 'root'</w:t>
+      </w:r>
+    </w:p>
+    <w:p>
+      <w:pPr>
+        <w:pBdr>
+          <w:bottom w:val="single" w:color="CCCCCC" w:sz="2"/>
+        </w:pBdr>
+        <w:spacing w:after="60" w:before="200"/>
+      </w:pPr>
+      <w:r>
+        <w:rPr>
+          <w:rFonts w:ascii="Consolas" w:cs="Consolas" w:eastAsia="Consolas" w:hAnsi="Consolas"/>
+          <w:b/>
+          <w:bCs/>
+          <w:color w:val="2F2F2F"/>
+          <w:sz w:val="24"/>
+          <w:szCs w:val="24"/>
+        </w:rPr>
+        <w:t xml:space="preserve">loadAsync</w:t>
+      </w:r>
+      <w:r>
+        <w:t xml:space="preserve">  </w:t>
+      </w:r>
+      <w:r>
+        <w:rPr>
+          <w:rFonts w:ascii="Calibri" w:cs="Calibri" w:eastAsia="Calibri" w:hAnsi="Calibri"/>
+          <w:b/>
+          <w:bCs/>
+          <w:color w:val="FFFFFF"/>
+          <w:sz w:val="16"/>
+          <w:szCs w:val="16"/>
+          <w:shd w:fill="7030A0" w:val="clear"/>
+        </w:rPr>
+        <w:t xml:space="preserve"> static method </w:t>
+      </w:r>
+    </w:p>
+    <w:p>
+      <w:pPr>
+        <w:spacing w:after="80"/>
+      </w:pPr>
+      <w:r>
+        <w:rPr>
+          <w:rFonts w:ascii="Calibri" w:cs="Calibri" w:eastAsia="Calibri" w:hAnsi="Calibri"/>
+          <w:b w:val="false"/>
+          <w:bCs w:val="false"/>
+          <w:i w:val="false"/>
+          <w:iCs w:val="false"/>
+          <w:color w:val="2F2F2F"/>
+          <w:sz w:val="20"/>
+          <w:szCs w:val="20"/>
+        </w:rPr>
+        <w:t xml:space="preserve">Reads an XML file asynchronously and returns an XDocument, including any XML declaration. Throws XmlParseError on malformed input; the error's filePath field is set to the provided path.</w:t>
+      </w:r>
+    </w:p>
+    <w:p>
+      <w:pPr>
+        <w:spacing w:after="40" w:before="100"/>
+      </w:pPr>
+      <w:r>
+        <w:rPr>
+          <w:rFonts w:ascii="Calibri" w:cs="Calibri" w:eastAsia="Calibri" w:hAnsi="Calibri"/>
+          <w:b/>
+          <w:bCs/>
+          <w:color w:val="2F2F2F"/>
+          <w:sz w:val="20"/>
+          <w:szCs w:val="20"/>
+        </w:rPr>
+        <w:t xml:space="preserve">Signature</w:t>
+      </w:r>
+    </w:p>
+    <w:p>
+      <w:pPr>
+        <w:shd w:fill="F2F2F2" w:val="clear"/>
+        <w:spacing w:after="0" w:before="0"/>
+        <w:ind w:left="360"/>
+      </w:pPr>
+      <w:r>
+        <w:rPr>
+          <w:rFonts w:ascii="Consolas" w:cs="Consolas" w:eastAsia="Consolas" w:hAnsi="Consolas"/>
+          <w:color w:val="1F3864"/>
+          <w:sz w:val="18"/>
+          <w:szCs w:val="18"/>
+        </w:rPr>
+        <w:t xml:space="preserve">public static async loadAsync(filePath: string): Promise&lt;XDocument&gt;</w:t>
+      </w:r>
+    </w:p>
+    <w:p>
+      <w:pPr>
+        <w:spacing w:after="60"/>
+      </w:pPr>
+    </w:p>
+    <w:p>
+      <w:pPr>
+        <w:spacing w:after="40" w:before="100"/>
+      </w:pPr>
+      <w:r>
+        <w:rPr>
+          <w:rFonts w:ascii="Calibri" w:cs="Calibri" w:eastAsia="Calibri" w:hAnsi="Calibri"/>
+          <w:b/>
+          <w:bCs/>
+          <w:color w:val="2F2F2F"/>
+          <w:sz w:val="20"/>
+          <w:szCs w:val="20"/>
+        </w:rPr>
+        <w:t xml:space="preserve">Parameters</w:t>
+      </w:r>
+    </w:p>
+    <w:tbl>
+      <w:tblPr>
+        <w:tblW w:type="pct" w:w="100%"/>
+        <w:tblBorders>
+          <w:top w:val="single" w:color="auto" w:sz="4"/>
+          <w:left w:val="single" w:color="auto" w:sz="4"/>
+          <w:bottom w:val="single" w:color="auto" w:sz="4"/>
+          <w:right w:val="single" w:color="auto" w:sz="4"/>
+          <w:insideH w:val="single" w:color="auto" w:sz="4"/>
+          <w:insideV w:val="single" w:color="auto" w:sz="4"/>
+        </w:tblBorders>
+      </w:tblPr>
+      <w:tblGrid>
+        <w:gridCol w:w="100"/>
+        <w:gridCol w:w="100"/>
+        <w:gridCol w:w="100"/>
+      </w:tblGrid>
+      <w:tr>
+        <w:trPr>
+          <w:tblHeader/>
+        </w:trPr>
+        <w:tc>
+          <w:tcPr>
+            <w:tcW w:type="pct" w:w="22%"/>
+            <w:shd w:fill="2E74B5" w:val="clear"/>
+          </w:tcPr>
+          <w:p>
+            <w:pPr>
+              <w:jc w:val="center"/>
+            </w:pPr>
+            <w:r>
+              <w:rPr>
+                <w:rFonts w:ascii="Calibri" w:cs="Calibri" w:eastAsia="Calibri" w:hAnsi="Calibri"/>
+                <w:b/>
+                <w:bCs/>
+                <w:color w:val="FFFFFF"/>
+                <w:sz w:val="18"/>
+                <w:szCs w:val="18"/>
+              </w:rPr>
+              <w:t xml:space="preserve">Parameter</w:t>
+            </w:r>
+          </w:p>
+        </w:tc>
+        <w:tc>
+          <w:tcPr>
+            <w:tcW w:type="pct" w:w="22%"/>
+            <w:shd w:fill="2E74B5" w:val="clear"/>
+          </w:tcPr>
+          <w:p>
+            <w:pPr>
+              <w:jc w:val="center"/>
+            </w:pPr>
+            <w:r>
+              <w:rPr>
+                <w:rFonts w:ascii="Calibri" w:cs="Calibri" w:eastAsia="Calibri" w:hAnsi="Calibri"/>
+                <w:b/>
+                <w:bCs/>
+                <w:color w:val="FFFFFF"/>
+                <w:sz w:val="18"/>
+                <w:szCs w:val="18"/>
+              </w:rPr>
+              <w:t xml:space="preserve">Type</w:t>
+            </w:r>
+          </w:p>
+        </w:tc>
+        <w:tc>
+          <w:tcPr>
+            <w:tcW w:type="pct" w:w="56%"/>
+            <w:shd w:fill="2E74B5" w:val="clear"/>
+          </w:tcPr>
+          <w:p>
+            <w:pPr>
+              <w:jc w:val="center"/>
+            </w:pPr>
+            <w:r>
+              <w:rPr>
+                <w:rFonts w:ascii="Calibri" w:cs="Calibri" w:eastAsia="Calibri" w:hAnsi="Calibri"/>
+                <w:b/>
+                <w:bCs/>
+                <w:color w:val="FFFFFF"/>
+                <w:sz w:val="18"/>
+                <w:szCs w:val="18"/>
+              </w:rPr>
+              <w:t xml:space="preserve">Description</w:t>
+            </w:r>
+          </w:p>
+        </w:tc>
+      </w:tr>
+      <w:tr>
+        <w:tc>
+          <w:p>
+            <w:r>
+              <w:rPr>
+                <w:rFonts w:ascii="Consolas" w:cs="Consolas" w:eastAsia="Consolas" w:hAnsi="Consolas"/>
+                <w:color w:val="2F2F2F"/>
+                <w:sz w:val="18"/>
+                <w:szCs w:val="18"/>
+              </w:rPr>
+              <w:t xml:space="preserve">filePath</w:t>
+            </w:r>
+          </w:p>
+        </w:tc>
+        <w:tc>
+          <w:p>
+            <w:r>
+              <w:rPr>
+                <w:rFonts w:ascii="Consolas" w:cs="Consolas" w:eastAsia="Consolas" w:hAnsi="Consolas"/>
+                <w:color w:val="2F2F2F"/>
+                <w:sz w:val="18"/>
+                <w:szCs w:val="18"/>
+              </w:rPr>
+              <w:t xml:space="preserve">string</w:t>
+            </w:r>
+          </w:p>
+        </w:tc>
+        <w:tc>
+          <w:p>
+            <w:r>
+              <w:rPr>
+                <w:rFonts w:ascii="Consolas" w:cs="Consolas" w:eastAsia="Consolas" w:hAnsi="Consolas"/>
+                <w:color w:val="2F2F2F"/>
+                <w:sz w:val="18"/>
+                <w:szCs w:val="18"/>
+              </w:rPr>
+              <w:t xml:space="preserve">Absolute or relative path to an XML file.</w:t>
+            </w:r>
+          </w:p>
+        </w:tc>
+      </w:tr>
+    </w:tbl>
+    <w:p>
+      <w:pPr>
+        <w:spacing w:after="60"/>
+      </w:pPr>
+    </w:p>
+    <w:p>
+      <w:pPr>
+        <w:spacing w:after="40" w:before="100"/>
+      </w:pPr>
+      <w:r>
+        <w:rPr>
+          <w:rFonts w:ascii="Calibri" w:cs="Calibri" w:eastAsia="Calibri" w:hAnsi="Calibri"/>
+          <w:b/>
+          <w:bCs/>
+          <w:color w:val="2F2F2F"/>
+          <w:sz w:val="20"/>
+          <w:szCs w:val="20"/>
+        </w:rPr>
+        <w:t xml:space="preserve">Returns</w:t>
+      </w:r>
+    </w:p>
+    <w:p>
+      <w:pPr>
+        <w:spacing w:after="80"/>
+      </w:pPr>
+      <w:r>
+        <w:rPr>
+          <w:rFonts w:ascii="Calibri" w:cs="Calibri" w:eastAsia="Calibri" w:hAnsi="Calibri"/>
+          <w:b w:val="false"/>
+          <w:bCs w:val="false"/>
+          <w:i w:val="false"/>
+          <w:iCs w:val="false"/>
+          <w:color w:val="2F2F2F"/>
+          <w:sz w:val="20"/>
+          <w:szCs w:val="20"/>
+        </w:rPr>
+        <w:t xml:space="preserve">Promise&lt;XDocument&gt; — resolves to the parsed document.</w:t>
+      </w:r>
+    </w:p>
+    <w:p>
+      <w:pPr>
+        <w:spacing w:after="40" w:before="100"/>
+      </w:pPr>
+      <w:r>
+        <w:rPr>
+          <w:rFonts w:ascii="Calibri" w:cs="Calibri" w:eastAsia="Calibri" w:hAnsi="Calibri"/>
+          <w:b/>
+          <w:bCs/>
+          <w:color w:val="2F2F2F"/>
+          <w:sz w:val="20"/>
+          <w:szCs w:val="20"/>
+        </w:rPr>
+        <w:t xml:space="preserve">Example</w:t>
+      </w:r>
+    </w:p>
+    <w:p>
+      <w:pPr>
+        <w:shd w:fill="F2F2F2" w:val="clear"/>
+        <w:spacing w:after="0" w:before="0"/>
+        <w:ind w:left="360"/>
+      </w:pPr>
+      <w:r>
+        <w:rPr>
+          <w:rFonts w:ascii="Consolas" w:cs="Consolas" w:eastAsia="Consolas" w:hAnsi="Consolas"/>
+          <w:color w:val="1F3864"/>
+          <w:sz w:val="18"/>
+          <w:szCs w:val="18"/>
+        </w:rPr>
+        <w:t xml:space="preserve">const doc = await XDocument.loadAsync('/path/to/doc.xml');</w:t>
+      </w:r>
+    </w:p>
+    <w:p>
+      <w:pPr>
+        <w:shd w:fill="F2F2F2" w:val="clear"/>
+        <w:spacing w:after="80" w:before="0"/>
+        <w:ind w:left="360"/>
+      </w:pPr>
+      <w:r>
+        <w:rPr>
+          <w:rFonts w:ascii="Consolas" w:cs="Consolas" w:eastAsia="Consolas" w:hAnsi="Consolas"/>
+          <w:color w:val="1F3864"/>
+          <w:sz w:val="18"/>
+          <w:szCs w:val="18"/>
+        </w:rPr>
+        <w:t xml:space="preserve">doc.declaration?.version; // '1.0'</w:t>
       </w:r>
     </w:p>
     <w:sectPr>

</xml_diff>